<commit_message>
docs: correct typos and improve wording in product backlog
</commit_message>
<xml_diff>
--- a/49K212.06_Product backlog.docx
+++ b/49K212.06_Product backlog.docx
@@ -13,7 +13,7 @@
           <w:noProof/>
         </w:rPr>
         <w:drawing>
-          <wp:inline distT="0" distB="0" distL="0" distR="0" wp14:anchorId="00A3E421" wp14:editId="2A73671C">
+          <wp:inline distT="0" distB="0" distL="0" distR="0" wp14:anchorId="00A3E421" wp14:editId="0258B7DE">
             <wp:extent cx="6160009" cy="8833104"/>
             <wp:effectExtent l="0" t="0" r="0" b="0"/>
             <wp:docPr id="20181" name="Picture 20181"/>
@@ -1726,6 +1726,171 @@
               </w:rPr>
               <w:t xml:space="preserve"> </w:t>
             </w:r>
+          </w:p>
+        </w:tc>
+      </w:tr>
+      <w:tr>
+        <w:trPr>
+          <w:trHeight w:val="1407"/>
+        </w:trPr>
+        <w:tc>
+          <w:tcPr>
+            <w:tcW w:w="1093" w:type="dxa"/>
+            <w:tcBorders>
+              <w:top w:val="single" w:sz="8" w:space="0" w:color="000000"/>
+              <w:left w:val="single" w:sz="8" w:space="0" w:color="000000"/>
+              <w:bottom w:val="single" w:sz="8" w:space="0" w:color="000000"/>
+              <w:right w:val="single" w:sz="8" w:space="0" w:color="000000"/>
+            </w:tcBorders>
+            <w:shd w:val="clear" w:color="auto" w:fill="FFFFFF" w:themeFill="background1"/>
+            <w:vAlign w:val="bottom"/>
+          </w:tcPr>
+          <w:p>
+            <w:pPr>
+              <w:spacing w:after="0"/>
+              <w:ind w:left="0" w:firstLine="0"/>
+              <w:jc w:val="left"/>
+              <w:rPr>
+                <w:sz w:val="26"/>
+              </w:rPr>
+            </w:pPr>
+            <w:r>
+              <w:rPr>
+                <w:sz w:val="26"/>
+              </w:rPr>
+              <w:t>2</w:t>
+            </w:r>
+          </w:p>
+        </w:tc>
+        <w:tc>
+          <w:tcPr>
+            <w:tcW w:w="2297" w:type="dxa"/>
+            <w:tcBorders>
+              <w:top w:val="single" w:sz="8" w:space="0" w:color="000000"/>
+              <w:left w:val="single" w:sz="8" w:space="0" w:color="000000"/>
+              <w:bottom w:val="single" w:sz="8" w:space="0" w:color="000000"/>
+              <w:right w:val="single" w:sz="8" w:space="0" w:color="000000"/>
+            </w:tcBorders>
+            <w:shd w:val="clear" w:color="auto" w:fill="FFFFFF" w:themeFill="background1"/>
+            <w:vAlign w:val="bottom"/>
+          </w:tcPr>
+          <w:p>
+            <w:pPr>
+              <w:spacing w:after="0"/>
+              <w:ind w:left="1" w:firstLine="0"/>
+              <w:rPr>
+                <w:sz w:val="26"/>
+                <w:lang w:val="vi-VN"/>
+              </w:rPr>
+            </w:pPr>
+            <w:r>
+              <w:rPr>
+                <w:sz w:val="26"/>
+              </w:rPr>
+              <w:t>Trịnh</w:t>
+            </w:r>
+            <w:r>
+              <w:rPr>
+                <w:sz w:val="26"/>
+                <w:lang w:val="vi-VN"/>
+              </w:rPr>
+              <w:t xml:space="preserve"> Thảo Nguyên</w:t>
+            </w:r>
+          </w:p>
+        </w:tc>
+        <w:tc>
+          <w:tcPr>
+            <w:tcW w:w="1419" w:type="dxa"/>
+            <w:tcBorders>
+              <w:top w:val="single" w:sz="8" w:space="0" w:color="000000"/>
+              <w:left w:val="single" w:sz="8" w:space="0" w:color="000000"/>
+              <w:bottom w:val="single" w:sz="8" w:space="0" w:color="000000"/>
+              <w:right w:val="single" w:sz="8" w:space="0" w:color="000000"/>
+            </w:tcBorders>
+            <w:shd w:val="clear" w:color="auto" w:fill="FFFFFF" w:themeFill="background1"/>
+            <w:vAlign w:val="bottom"/>
+          </w:tcPr>
+          <w:p>
+            <w:pPr>
+              <w:spacing w:after="0"/>
+              <w:ind w:left="1" w:firstLine="0"/>
+              <w:rPr>
+                <w:sz w:val="26"/>
+                <w:lang w:val="vi-VN"/>
+              </w:rPr>
+            </w:pPr>
+            <w:r>
+              <w:rPr>
+                <w:sz w:val="26"/>
+              </w:rPr>
+              <w:t>25</w:t>
+            </w:r>
+            <w:r>
+              <w:rPr>
+                <w:sz w:val="26"/>
+                <w:lang w:val="vi-VN"/>
+              </w:rPr>
+              <w:t>/03/2026</w:t>
+            </w:r>
+          </w:p>
+        </w:tc>
+        <w:tc>
+          <w:tcPr>
+            <w:tcW w:w="3050" w:type="dxa"/>
+            <w:tcBorders>
+              <w:top w:val="single" w:sz="8" w:space="0" w:color="000000"/>
+              <w:left w:val="single" w:sz="8" w:space="0" w:color="000000"/>
+              <w:bottom w:val="single" w:sz="8" w:space="0" w:color="000000"/>
+              <w:right w:val="single" w:sz="8" w:space="0" w:color="000000"/>
+            </w:tcBorders>
+            <w:shd w:val="clear" w:color="auto" w:fill="FFFFFF" w:themeFill="background1"/>
+            <w:vAlign w:val="bottom"/>
+          </w:tcPr>
+          <w:p>
+            <w:pPr>
+              <w:spacing w:after="0"/>
+              <w:ind w:left="1" w:firstLine="0"/>
+              <w:rPr>
+                <w:sz w:val="26"/>
+                <w:lang w:val="vi-VN"/>
+              </w:rPr>
+            </w:pPr>
+            <w:r>
+              <w:rPr>
+                <w:sz w:val="26"/>
+              </w:rPr>
+              <w:t>Bổ</w:t>
+            </w:r>
+            <w:r>
+              <w:rPr>
+                <w:sz w:val="26"/>
+                <w:lang w:val="vi-VN"/>
+              </w:rPr>
+              <w:t xml:space="preserve"> sung chức năng vào user story là “Sách đã mua”</w:t>
+            </w:r>
+          </w:p>
+        </w:tc>
+        <w:tc>
+          <w:tcPr>
+            <w:tcW w:w="1483" w:type="dxa"/>
+            <w:tcBorders>
+              <w:top w:val="single" w:sz="8" w:space="0" w:color="000000"/>
+              <w:left w:val="single" w:sz="8" w:space="0" w:color="000000"/>
+              <w:bottom w:val="single" w:sz="8" w:space="0" w:color="000000"/>
+              <w:right w:val="single" w:sz="8" w:space="0" w:color="000000"/>
+            </w:tcBorders>
+            <w:shd w:val="clear" w:color="auto" w:fill="FFFFFF" w:themeFill="background1"/>
+            <w:vAlign w:val="bottom"/>
+          </w:tcPr>
+          <w:p>
+            <w:pPr>
+              <w:spacing w:after="0"/>
+              <w:ind w:left="1" w:firstLine="0"/>
+              <w:jc w:val="center"/>
+              <w:rPr>
+                <w:sz w:val="26"/>
+              </w:rPr>
+            </w:pPr>
           </w:p>
         </w:tc>
       </w:tr>
@@ -7406,7 +7571,7 @@
                 <w:szCs w:val="20"/>
                 <w:lang w:val="vi-VN"/>
               </w:rPr>
-              <w:t>- Xem danh sách sách đã mua</w:t>
+              <w:t>- Xem danh sách đã mua</w:t>
             </w:r>
           </w:p>
         </w:tc>
@@ -7649,30 +7814,6 @@
                 <w:lang w:val="vi-VN"/>
               </w:rPr>
               <w:t>- Đánh giá người bán theo số sao</w:t>
-            </w:r>
-          </w:p>
-          <w:p>
-            <w:pPr>
-              <w:widowControl w:val="0"/>
-              <w:spacing w:line="276" w:lineRule="auto"/>
-              <w:jc w:val="left"/>
-              <w:rPr>
-                <w:rFonts w:eastAsia="Arial"/>
-                <w:color w:val="auto"/>
-                <w:sz w:val="20"/>
-                <w:szCs w:val="20"/>
-                <w:lang w:val="vi-VN"/>
-              </w:rPr>
-            </w:pPr>
-            <w:r>
-              <w:rPr>
-                <w:rFonts w:eastAsia="Arial"/>
-                <w:color w:val="auto"/>
-                <w:sz w:val="20"/>
-                <w:szCs w:val="20"/>
-                <w:lang w:val="vi-VN"/>
-              </w:rPr>
-              <w:t>- Xem điểm đánh giá của người bán</w:t>
             </w:r>
           </w:p>
         </w:tc>

</xml_diff>

<commit_message>
Update: Them mon hoc moi
</commit_message>
<xml_diff>
--- a/49K212.06_Product backlog.docx
+++ b/49K212.06_Product backlog.docx
@@ -6379,14 +6379,256 @@
           </w:p>
         </w:tc>
       </w:tr>
+      <w:tr>
+        <w:trPr>
+          <w:trHeight w:val="1025"/>
+        </w:trPr>
+        <w:tc>
+          <w:tcPr>
+            <w:tcW w:w="1080" w:type="dxa"/>
+            <w:tcBorders>
+              <w:top w:val="single" w:sz="4" w:space="0" w:color="auto"/>
+              <w:left w:val="single" w:sz="4" w:space="0" w:color="auto"/>
+              <w:bottom w:val="single" w:sz="4" w:space="0" w:color="auto"/>
+              <w:right w:val="single" w:sz="4" w:space="0" w:color="auto"/>
+            </w:tcBorders>
+            <w:tcMar>
+              <w:top w:w="40" w:type="dxa"/>
+              <w:left w:w="40" w:type="dxa"/>
+              <w:bottom w:w="40" w:type="dxa"/>
+              <w:right w:w="40" w:type="dxa"/>
+            </w:tcMar>
+            <w:vAlign w:val="center"/>
+          </w:tcPr>
+          <w:p>
+            <w:pPr>
+              <w:widowControl w:val="0"/>
+              <w:spacing w:line="276" w:lineRule="auto"/>
+              <w:jc w:val="left"/>
+              <w:rPr>
+                <w:rFonts w:eastAsia="Arial"/>
+                <w:color w:val="auto"/>
+                <w:sz w:val="20"/>
+                <w:szCs w:val="20"/>
+              </w:rPr>
+            </w:pPr>
+            <w:r>
+              <w:rPr>
+                <w:rFonts w:eastAsia="Arial"/>
+                <w:color w:val="auto"/>
+                <w:sz w:val="20"/>
+                <w:szCs w:val="20"/>
+              </w:rPr>
+              <w:t>US18</w:t>
+            </w:r>
+          </w:p>
+        </w:tc>
+        <w:tc>
+          <w:tcPr>
+            <w:tcW w:w="1472" w:type="dxa"/>
+            <w:tcBorders>
+              <w:top w:val="single" w:sz="4" w:space="0" w:color="auto"/>
+              <w:left w:val="single" w:sz="4" w:space="0" w:color="auto"/>
+              <w:bottom w:val="single" w:sz="4" w:space="0" w:color="auto"/>
+              <w:right w:val="single" w:sz="4" w:space="0" w:color="auto"/>
+            </w:tcBorders>
+            <w:shd w:val="clear" w:color="auto" w:fill="FFFFFF"/>
+            <w:tcMar>
+              <w:top w:w="40" w:type="dxa"/>
+              <w:left w:w="40" w:type="dxa"/>
+              <w:bottom w:w="40" w:type="dxa"/>
+              <w:right w:w="40" w:type="dxa"/>
+            </w:tcMar>
+            <w:vAlign w:val="center"/>
+          </w:tcPr>
+          <w:p>
+            <w:pPr>
+              <w:widowControl w:val="0"/>
+              <w:spacing w:line="276" w:lineRule="auto"/>
+              <w:jc w:val="left"/>
+              <w:rPr>
+                <w:rFonts w:eastAsia="Arial"/>
+                <w:color w:val="auto"/>
+                <w:sz w:val="20"/>
+                <w:szCs w:val="20"/>
+                <w:lang w:val="vi-VN"/>
+              </w:rPr>
+            </w:pPr>
+            <w:r>
+              <w:rPr>
+                <w:rFonts w:eastAsia="Arial"/>
+                <w:color w:val="auto"/>
+                <w:sz w:val="20"/>
+                <w:szCs w:val="20"/>
+              </w:rPr>
+              <w:t>Người</w:t>
+            </w:r>
+            <w:r>
+              <w:rPr>
+                <w:rFonts w:eastAsia="Arial"/>
+                <w:color w:val="auto"/>
+                <w:sz w:val="20"/>
+                <w:szCs w:val="20"/>
+                <w:lang w:val="vi-VN"/>
+              </w:rPr>
+              <w:t xml:space="preserve"> dùng</w:t>
+            </w:r>
+          </w:p>
+        </w:tc>
+        <w:tc>
+          <w:tcPr>
+            <w:tcW w:w="2308" w:type="dxa"/>
+            <w:tcBorders>
+              <w:top w:val="single" w:sz="4" w:space="0" w:color="auto"/>
+              <w:left w:val="single" w:sz="4" w:space="0" w:color="auto"/>
+              <w:bottom w:val="single" w:sz="4" w:space="0" w:color="auto"/>
+              <w:right w:val="single" w:sz="4" w:space="0" w:color="auto"/>
+            </w:tcBorders>
+            <w:shd w:val="clear" w:color="auto" w:fill="FFFFFF"/>
+            <w:tcMar>
+              <w:top w:w="40" w:type="dxa"/>
+              <w:left w:w="40" w:type="dxa"/>
+              <w:bottom w:w="40" w:type="dxa"/>
+              <w:right w:w="40" w:type="dxa"/>
+            </w:tcMar>
+            <w:vAlign w:val="center"/>
+          </w:tcPr>
+          <w:p>
+            <w:pPr>
+              <w:widowControl w:val="0"/>
+              <w:spacing w:line="276" w:lineRule="auto"/>
+              <w:jc w:val="left"/>
+              <w:rPr>
+                <w:rFonts w:eastAsia="Arial"/>
+                <w:color w:val="auto"/>
+                <w:sz w:val="20"/>
+                <w:szCs w:val="20"/>
+                <w:lang w:val="vi-VN"/>
+              </w:rPr>
+            </w:pPr>
+            <w:r>
+              <w:rPr>
+                <w:rFonts w:eastAsia="Arial"/>
+                <w:color w:val="auto"/>
+                <w:sz w:val="20"/>
+                <w:szCs w:val="20"/>
+                <w:lang w:val="vi-VN"/>
+              </w:rPr>
+              <w:t>Thêm môn học mới vào danh mục sách</w:t>
+            </w:r>
+          </w:p>
+        </w:tc>
+        <w:tc>
+          <w:tcPr>
+            <w:tcW w:w="3240" w:type="dxa"/>
+            <w:tcBorders>
+              <w:top w:val="single" w:sz="4" w:space="0" w:color="auto"/>
+              <w:left w:val="single" w:sz="4" w:space="0" w:color="auto"/>
+              <w:bottom w:val="single" w:sz="4" w:space="0" w:color="auto"/>
+              <w:right w:val="single" w:sz="4" w:space="0" w:color="auto"/>
+            </w:tcBorders>
+            <w:shd w:val="clear" w:color="auto" w:fill="FFFFFF"/>
+            <w:tcMar>
+              <w:top w:w="40" w:type="dxa"/>
+              <w:left w:w="40" w:type="dxa"/>
+              <w:bottom w:w="40" w:type="dxa"/>
+              <w:right w:w="40" w:type="dxa"/>
+            </w:tcMar>
+            <w:vAlign w:val="center"/>
+          </w:tcPr>
+          <w:p>
+            <w:pPr>
+              <w:widowControl w:val="0"/>
+              <w:spacing w:line="276" w:lineRule="auto"/>
+              <w:jc w:val="left"/>
+              <w:rPr>
+                <w:rFonts w:eastAsia="Arial"/>
+                <w:color w:val="auto"/>
+                <w:sz w:val="20"/>
+                <w:szCs w:val="20"/>
+                <w:lang w:val="vi-VN"/>
+              </w:rPr>
+            </w:pPr>
+            <w:r>
+              <w:rPr>
+                <w:rFonts w:eastAsia="Arial"/>
+                <w:color w:val="auto"/>
+                <w:sz w:val="20"/>
+                <w:szCs w:val="20"/>
+                <w:lang w:val="vi-VN"/>
+              </w:rPr>
+              <w:t>C</w:t>
+            </w:r>
+            <w:r>
+              <w:rPr>
+                <w:rFonts w:eastAsia="Arial"/>
+                <w:color w:val="auto"/>
+                <w:sz w:val="20"/>
+                <w:szCs w:val="20"/>
+                <w:lang w:val="vi-VN"/>
+              </w:rPr>
+              <w:t>ó thể lọc sách theo môn học chính xác và đầy đủ, giúp việc tìm kiếm sách hiệu quả hơn</w:t>
+            </w:r>
+          </w:p>
+        </w:tc>
+        <w:tc>
+          <w:tcPr>
+            <w:tcW w:w="1260" w:type="dxa"/>
+            <w:tcBorders>
+              <w:top w:val="single" w:sz="4" w:space="0" w:color="auto"/>
+              <w:left w:val="single" w:sz="4" w:space="0" w:color="auto"/>
+              <w:bottom w:val="single" w:sz="4" w:space="0" w:color="auto"/>
+              <w:right w:val="single" w:sz="4" w:space="0" w:color="auto"/>
+            </w:tcBorders>
+            <w:shd w:val="clear" w:color="auto" w:fill="FFFFFF"/>
+            <w:tcMar>
+              <w:top w:w="40" w:type="dxa"/>
+              <w:left w:w="40" w:type="dxa"/>
+              <w:bottom w:w="40" w:type="dxa"/>
+              <w:right w:w="40" w:type="dxa"/>
+            </w:tcMar>
+            <w:vAlign w:val="center"/>
+          </w:tcPr>
+          <w:p>
+            <w:pPr>
+              <w:widowControl w:val="0"/>
+              <w:spacing w:line="276" w:lineRule="auto"/>
+              <w:jc w:val="left"/>
+              <w:rPr>
+                <w:rFonts w:eastAsia="Arial"/>
+                <w:color w:val="auto"/>
+                <w:sz w:val="20"/>
+                <w:szCs w:val="20"/>
+                <w:lang w:val="vi-VN"/>
+              </w:rPr>
+            </w:pPr>
+            <w:r>
+              <w:rPr>
+                <w:rFonts w:eastAsia="Arial"/>
+                <w:color w:val="auto"/>
+                <w:sz w:val="20"/>
+                <w:szCs w:val="20"/>
+                <w:lang w:val="vi-VN"/>
+              </w:rPr>
+              <w:t>Medium</w:t>
+            </w:r>
+          </w:p>
+        </w:tc>
+      </w:tr>
     </w:tbl>
     <w:p>
       <w:pPr>
         <w:spacing w:after="128"/>
         <w:ind w:left="0" w:firstLine="0"/>
         <w:jc w:val="left"/>
+        <w:rPr>
+          <w:lang w:val="vi-VN"/>
+        </w:rPr>
       </w:pPr>
       <w:r>
+        <w:rPr>
+          <w:lang w:val="vi-VN"/>
+        </w:rPr>
         <w:t xml:space="preserve"> </w:t>
       </w:r>
     </w:p>
@@ -6822,6 +7064,7 @@
                 <w:szCs w:val="20"/>
                 <w:lang w:val="vi-VN"/>
               </w:rPr>
+              <w:lastRenderedPageBreak/>
               <w:t>- Khôi phục mật khẩu khi quên</w:t>
             </w:r>
           </w:p>
@@ -6869,7 +7112,6 @@
                 <w:szCs w:val="20"/>
                 <w:lang w:val="vi-VN"/>
               </w:rPr>
-              <w:lastRenderedPageBreak/>
               <w:t>- Đăng xuất khỏi hệ thống</w:t>
             </w:r>
           </w:p>
@@ -7255,6 +7497,30 @@
                 <w:lang w:val="vi-VN"/>
               </w:rPr>
               <w:t>- Sách của tôi</w:t>
+            </w:r>
+          </w:p>
+          <w:p>
+            <w:pPr>
+              <w:widowControl w:val="0"/>
+              <w:spacing w:line="276" w:lineRule="auto"/>
+              <w:jc w:val="left"/>
+              <w:rPr>
+                <w:rFonts w:eastAsia="Arial"/>
+                <w:color w:val="auto"/>
+                <w:sz w:val="20"/>
+                <w:szCs w:val="20"/>
+                <w:lang w:val="vi-VN"/>
+              </w:rPr>
+            </w:pPr>
+            <w:r>
+              <w:rPr>
+                <w:rFonts w:eastAsia="Arial"/>
+                <w:color w:val="auto"/>
+                <w:sz w:val="20"/>
+                <w:szCs w:val="20"/>
+                <w:lang w:val="vi-VN"/>
+              </w:rPr>
+              <w:t>- Thêm môn học</w:t>
             </w:r>
           </w:p>
         </w:tc>
@@ -10030,7 +10296,6 @@
   <w:style w:type="character" w:default="1" w:styleId="Phngmcinhcuaoanvn">
     <w:name w:val="Default Paragraph Font"/>
     <w:uiPriority w:val="1"/>
-    <w:semiHidden/>
     <w:unhideWhenUsed/>
   </w:style>
   <w:style w:type="table" w:default="1" w:styleId="BangThngthng">

</xml_diff>